<commit_message>
Update sample CV fixtures and add fresh module output
</commit_message>
<xml_diff>
--- a/apps/api/test-fixtures/sample-cv.docx
+++ b/apps/api/test-fixtures/sample-cv.docx
@@ -52,6 +52,10 @@
         <w:t xml:space="preserve">Senior Software Engineer — Acme Corporation (San Francisco, CA)</w:t>
       </w:r>
       <w:r>
+        <w:rPr>
+          <w:i/>
+          <w:iCs/>
+        </w:rPr>
         <w:t xml:space="preserve">   [2022-03 to Present]</w:t>
       </w:r>
     </w:p>
@@ -80,6 +84,10 @@
         <w:t xml:space="preserve">Software Engineer — CloudTech Solutions (San Jose, CA)</w:t>
       </w:r>
       <w:r>
+        <w:rPr>
+          <w:i/>
+          <w:iCs/>
+        </w:rPr>
         <w:t xml:space="preserve">   [2019-06 to 2022-02]</w:t>
       </w:r>
     </w:p>
@@ -111,6 +119,10 @@
         <w:t xml:space="preserve">Bachelor of Science in Computer Science — University of California, Berkeley</w:t>
       </w:r>
       <w:r>
+        <w:rPr>
+          <w:i/>
+          <w:iCs/>
+        </w:rPr>
         <w:t xml:space="preserve"> (2015-08 to 2019-05)</w:t>
       </w:r>
     </w:p>

</xml_diff>